<commit_message>
ajustes finais na aplicacao
</commit_message>
<xml_diff>
--- a/doc/Projeto-PosFiap-App_Imesa_parte2.docx
+++ b/doc/Projeto-PosFiap-App_Imesa_parte2.docx
@@ -187,7 +187,15 @@
         <w:t xml:space="preserve">, </w:t>
       </w:r>
       <w:r>
-        <w:t xml:space="preserve">conceito difundido por Uncle Bob, onde a ideia central é separar as responsabilidades e dependências de forma que a lógica fique isolada das dependências externas, como frameworks, bancos de dados, apis e etc. </w:t>
+        <w:t xml:space="preserve">conceito difundido por Uncle Bob, onde a ideia central é separar as responsabilidades e dependências de forma que a lógica fique isolada das dependências externas, como frameworks, bancos de dados, </w:t>
+      </w:r>
+      <w:proofErr w:type="gramStart"/>
+      <w:r>
+        <w:t>apis e etc.</w:t>
+      </w:r>
+      <w:proofErr w:type="gramEnd"/>
+      <w:r>
+        <w:t xml:space="preserve"> </w:t>
       </w:r>
     </w:p>
     <w:p>
@@ -530,7 +538,23 @@
           <w:b/>
           <w:bCs/>
         </w:rPr>
-        <w:t xml:space="preserve">Consulta Todos Tipos de </w:t>
+        <w:t xml:space="preserve">Consulta </w:t>
+      </w:r>
+      <w:proofErr w:type="gramStart"/>
+      <w:r>
+        <w:rPr>
+          <w:b/>
+          <w:bCs/>
+        </w:rPr>
+        <w:t>Todos Tipos</w:t>
+      </w:r>
+      <w:proofErr w:type="gramEnd"/>
+      <w:r>
+        <w:rPr>
+          <w:b/>
+          <w:bCs/>
+        </w:rPr>
+        <w:t xml:space="preserve"> de </w:t>
       </w:r>
       <w:proofErr w:type="spellStart"/>
       <w:r>
@@ -969,7 +993,23 @@
           <w:b/>
           <w:bCs/>
         </w:rPr>
-        <w:t xml:space="preserve"> por Criar tipos de </w:t>
+        <w:t xml:space="preserve"> </w:t>
+      </w:r>
+      <w:proofErr w:type="gramStart"/>
+      <w:r>
+        <w:rPr>
+          <w:b/>
+          <w:bCs/>
+        </w:rPr>
+        <w:t>por Criar</w:t>
+      </w:r>
+      <w:proofErr w:type="gramEnd"/>
+      <w:r>
+        <w:rPr>
+          <w:b/>
+          <w:bCs/>
+        </w:rPr>
+        <w:t xml:space="preserve"> tipos de </w:t>
       </w:r>
       <w:proofErr w:type="spellStart"/>
       <w:r>
@@ -1400,7 +1440,23 @@
           <w:b/>
           <w:bCs/>
         </w:rPr>
-        <w:t xml:space="preserve"> por Atualizar tipos de </w:t>
+        <w:t xml:space="preserve"> </w:t>
+      </w:r>
+      <w:proofErr w:type="gramStart"/>
+      <w:r>
+        <w:rPr>
+          <w:b/>
+          <w:bCs/>
+        </w:rPr>
+        <w:t>por Atualizar</w:t>
+      </w:r>
+      <w:proofErr w:type="gramEnd"/>
+      <w:r>
+        <w:rPr>
+          <w:b/>
+          <w:bCs/>
+        </w:rPr>
+        <w:t xml:space="preserve"> tipos de </w:t>
       </w:r>
       <w:proofErr w:type="spellStart"/>
       <w:r>
@@ -1842,7 +1898,23 @@
           <w:b/>
           <w:bCs/>
         </w:rPr>
-        <w:t xml:space="preserve"> por Deletar um tipo de </w:t>
+        <w:t xml:space="preserve"> </w:t>
+      </w:r>
+      <w:proofErr w:type="gramStart"/>
+      <w:r>
+        <w:rPr>
+          <w:b/>
+          <w:bCs/>
+        </w:rPr>
+        <w:t>por Deletar</w:t>
+      </w:r>
+      <w:proofErr w:type="gramEnd"/>
+      <w:r>
+        <w:rPr>
+          <w:b/>
+          <w:bCs/>
+        </w:rPr>
+        <w:t xml:space="preserve"> um tipo de </w:t>
       </w:r>
       <w:proofErr w:type="spellStart"/>
       <w:r>
@@ -2310,7 +2382,23 @@
           <w:b/>
           <w:bCs/>
         </w:rPr>
-        <w:t xml:space="preserve"> por Consultar todos os tipos cozinha</w:t>
+        <w:t xml:space="preserve"> </w:t>
+      </w:r>
+      <w:proofErr w:type="gramStart"/>
+      <w:r>
+        <w:rPr>
+          <w:b/>
+          <w:bCs/>
+        </w:rPr>
+        <w:t>por Consultar</w:t>
+      </w:r>
+      <w:proofErr w:type="gramEnd"/>
+      <w:r>
+        <w:rPr>
+          <w:b/>
+          <w:bCs/>
+        </w:rPr>
+        <w:t xml:space="preserve"> todos os tipos cozinha</w:t>
       </w:r>
     </w:p>
     <w:p>
@@ -2721,7 +2809,23 @@
           <w:b/>
           <w:bCs/>
         </w:rPr>
-        <w:t xml:space="preserve"> por Criar tipos de Cozinhas</w:t>
+        <w:t xml:space="preserve"> </w:t>
+      </w:r>
+      <w:proofErr w:type="gramStart"/>
+      <w:r>
+        <w:rPr>
+          <w:b/>
+          <w:bCs/>
+        </w:rPr>
+        <w:t>por Criar</w:t>
+      </w:r>
+      <w:proofErr w:type="gramEnd"/>
+      <w:r>
+        <w:rPr>
+          <w:b/>
+          <w:bCs/>
+        </w:rPr>
+        <w:t xml:space="preserve"> tipos de Cozinhas</w:t>
       </w:r>
     </w:p>
     <w:p>
@@ -3112,7 +3216,23 @@
           <w:b/>
           <w:bCs/>
         </w:rPr>
-        <w:t xml:space="preserve"> por Atualizar tipos de </w:t>
+        <w:t xml:space="preserve"> </w:t>
+      </w:r>
+      <w:proofErr w:type="gramStart"/>
+      <w:r>
+        <w:rPr>
+          <w:b/>
+          <w:bCs/>
+        </w:rPr>
+        <w:t>por Atualizar</w:t>
+      </w:r>
+      <w:proofErr w:type="gramEnd"/>
+      <w:r>
+        <w:rPr>
+          <w:b/>
+          <w:bCs/>
+        </w:rPr>
+        <w:t xml:space="preserve"> tipos de </w:t>
       </w:r>
       <w:r>
         <w:rPr>
@@ -3455,7 +3575,23 @@
           <w:b/>
           <w:bCs/>
         </w:rPr>
-        <w:t xml:space="preserve"> por Deletar um tipo de cozinha com base em seu id</w:t>
+        <w:t xml:space="preserve"> </w:t>
+      </w:r>
+      <w:proofErr w:type="gramStart"/>
+      <w:r>
+        <w:rPr>
+          <w:b/>
+          <w:bCs/>
+        </w:rPr>
+        <w:t>por Deletar</w:t>
+      </w:r>
+      <w:proofErr w:type="gramEnd"/>
+      <w:r>
+        <w:rPr>
+          <w:b/>
+          <w:bCs/>
+        </w:rPr>
+        <w:t xml:space="preserve"> um tipo de cozinha com base em seu id</w:t>
       </w:r>
     </w:p>
     <w:p>
@@ -3866,7 +4002,23 @@
           <w:b/>
           <w:bCs/>
         </w:rPr>
-        <w:t xml:space="preserve"> por Criar um novo </w:t>
+        <w:t xml:space="preserve"> </w:t>
+      </w:r>
+      <w:proofErr w:type="gramStart"/>
+      <w:r>
+        <w:rPr>
+          <w:b/>
+          <w:bCs/>
+        </w:rPr>
+        <w:t>por Criar</w:t>
+      </w:r>
+      <w:proofErr w:type="gramEnd"/>
+      <w:r>
+        <w:rPr>
+          <w:b/>
+          <w:bCs/>
+        </w:rPr>
+        <w:t xml:space="preserve"> um novo </w:t>
       </w:r>
       <w:proofErr w:type="spellStart"/>
       <w:r>
@@ -5280,7 +5432,23 @@
           <w:b/>
           <w:bCs/>
         </w:rPr>
-        <w:t xml:space="preserve"> por Consultar os dados de um </w:t>
+        <w:t xml:space="preserve"> </w:t>
+      </w:r>
+      <w:proofErr w:type="gramStart"/>
+      <w:r>
+        <w:rPr>
+          <w:b/>
+          <w:bCs/>
+        </w:rPr>
+        <w:t>por Consultar</w:t>
+      </w:r>
+      <w:proofErr w:type="gramEnd"/>
+      <w:r>
+        <w:rPr>
+          <w:b/>
+          <w:bCs/>
+        </w:rPr>
+        <w:t xml:space="preserve"> os dados de um </w:t>
       </w:r>
       <w:proofErr w:type="spellStart"/>
       <w:r>
@@ -6403,10 +6571,18 @@
         <w:t xml:space="preserve"> </w:t>
       </w:r>
       <w:r>
-        <w:t>e mensagem “</w:t>
-      </w:r>
-      <w:r>
-        <w:t>As senha nova não coincide com a confirmação de senha</w:t>
+        <w:t xml:space="preserve">e mensagem </w:t>
+      </w:r>
+      <w:proofErr w:type="gramStart"/>
+      <w:r>
+        <w:t>“</w:t>
+      </w:r>
+      <w:r>
+        <w:t>As senha nova</w:t>
+      </w:r>
+      <w:proofErr w:type="gramEnd"/>
+      <w:r>
+        <w:t xml:space="preserve"> não coincide com a confirmação de senha</w:t>
       </w:r>
       <w:r>
         <w:t>”</w:t>
@@ -7183,7 +7359,23 @@
           <w:b/>
           <w:bCs/>
         </w:rPr>
-        <w:t xml:space="preserve"> por Deletar um </w:t>
+        <w:t xml:space="preserve"> </w:t>
+      </w:r>
+      <w:proofErr w:type="gramStart"/>
+      <w:r>
+        <w:rPr>
+          <w:b/>
+          <w:bCs/>
+        </w:rPr>
+        <w:t>por Deletar</w:t>
+      </w:r>
+      <w:proofErr w:type="gramEnd"/>
+      <w:r>
+        <w:rPr>
+          <w:b/>
+          <w:bCs/>
+        </w:rPr>
+        <w:t xml:space="preserve"> um </w:t>
       </w:r>
       <w:proofErr w:type="spellStart"/>
       <w:r>
@@ -9021,7 +9213,23 @@
           <w:b/>
           <w:bCs/>
         </w:rPr>
-        <w:t xml:space="preserve"> por Atualizar os dados de um Restaurante</w:t>
+        <w:t xml:space="preserve"> </w:t>
+      </w:r>
+      <w:proofErr w:type="gramStart"/>
+      <w:r>
+        <w:rPr>
+          <w:b/>
+          <w:bCs/>
+        </w:rPr>
+        <w:t>por Atualizar</w:t>
+      </w:r>
+      <w:proofErr w:type="gramEnd"/>
+      <w:r>
+        <w:rPr>
+          <w:b/>
+          <w:bCs/>
+        </w:rPr>
+        <w:t xml:space="preserve"> os dados de um Restaurante</w:t>
       </w:r>
     </w:p>
     <w:p>
@@ -9719,7 +9927,23 @@
           <w:b/>
           <w:bCs/>
         </w:rPr>
-        <w:t xml:space="preserve"> por Deletar um restaurante</w:t>
+        <w:t xml:space="preserve"> </w:t>
+      </w:r>
+      <w:proofErr w:type="gramStart"/>
+      <w:r>
+        <w:rPr>
+          <w:b/>
+          <w:bCs/>
+        </w:rPr>
+        <w:t>por Deletar</w:t>
+      </w:r>
+      <w:proofErr w:type="gramEnd"/>
+      <w:r>
+        <w:rPr>
+          <w:b/>
+          <w:bCs/>
+        </w:rPr>
+        <w:t xml:space="preserve"> um restaurante</w:t>
       </w:r>
     </w:p>
     <w:p>
@@ -11594,7 +11818,23 @@
           <w:b/>
           <w:bCs/>
         </w:rPr>
-        <w:t xml:space="preserve"> por Deletar um </w:t>
+        <w:t xml:space="preserve"> </w:t>
+      </w:r>
+      <w:proofErr w:type="gramStart"/>
+      <w:r>
+        <w:rPr>
+          <w:b/>
+          <w:bCs/>
+        </w:rPr>
+        <w:t>por Deletar</w:t>
+      </w:r>
+      <w:proofErr w:type="gramEnd"/>
+      <w:r>
+        <w:rPr>
+          <w:b/>
+          <w:bCs/>
+        </w:rPr>
+        <w:t xml:space="preserve"> um </w:t>
       </w:r>
       <w:proofErr w:type="spellStart"/>
       <w:r>
@@ -12188,7 +12428,23 @@
           <w:b/>
           <w:bCs/>
         </w:rPr>
-        <w:t xml:space="preserve"> por Criar um item para um cardápio </w:t>
+        <w:t xml:space="preserve"> </w:t>
+      </w:r>
+      <w:proofErr w:type="gramStart"/>
+      <w:r>
+        <w:rPr>
+          <w:b/>
+          <w:bCs/>
+        </w:rPr>
+        <w:t>por Criar</w:t>
+      </w:r>
+      <w:proofErr w:type="gramEnd"/>
+      <w:r>
+        <w:rPr>
+          <w:b/>
+          <w:bCs/>
+        </w:rPr>
+        <w:t xml:space="preserve"> um item para um cardápio </w:t>
       </w:r>
     </w:p>
     <w:p>
@@ -12502,7 +12758,23 @@
           <w:b/>
           <w:bCs/>
         </w:rPr>
-        <w:t xml:space="preserve"> por Atualizar um item para um cardápio</w:t>
+        <w:t xml:space="preserve"> </w:t>
+      </w:r>
+      <w:proofErr w:type="gramStart"/>
+      <w:r>
+        <w:rPr>
+          <w:b/>
+          <w:bCs/>
+        </w:rPr>
+        <w:t>por Atualizar</w:t>
+      </w:r>
+      <w:proofErr w:type="gramEnd"/>
+      <w:r>
+        <w:rPr>
+          <w:b/>
+          <w:bCs/>
+        </w:rPr>
+        <w:t xml:space="preserve"> um item para um cardápio</w:t>
       </w:r>
     </w:p>
     <w:p>
@@ -14109,10 +14381,12 @@
         <w:t xml:space="preserve"> Em nosso caso deixamos comentado apenas para quando for testar não ficar consumindo espaço da </w:t>
       </w:r>
       <w:proofErr w:type="spellStart"/>
+      <w:proofErr w:type="gramStart"/>
       <w:r>
         <w:t>maquina</w:t>
       </w:r>
       <w:proofErr w:type="spellEnd"/>
+      <w:proofErr w:type="gramEnd"/>
       <w:r>
         <w:t xml:space="preserve"> quando o container for destruído.</w:t>
       </w:r>
@@ -14155,8 +14429,13 @@
         <w:t>context</w:t>
       </w:r>
       <w:proofErr w:type="spellEnd"/>
-      <w:r>
-        <w:t>: .).</w:t>
+      <w:proofErr w:type="gramStart"/>
+      <w:r>
+        <w:t>: .</w:t>
+      </w:r>
+      <w:proofErr w:type="gramEnd"/>
+      <w:r>
+        <w:t>).</w:t>
       </w:r>
     </w:p>
     <w:p>
@@ -14985,7 +15264,7 @@
           <w:rPr>
             <w:rStyle w:val="Hyperlink"/>
           </w:rPr>
-          <w:t>https://github.com/inisap/pos-fiap-imesa/blob/release-candidate-0.0.1/doc/Post%20Tech%20Fiap%20Imesa.postman_collection.json</w:t>
+          <w:t>https://github.com/inisap/pos-fiap-imesa/blob/release-candidate-0.0.2/doc/Post%20Tech%20Fiap%20Imesa%20release%202.postman_collection.json</w:t>
         </w:r>
       </w:hyperlink>
       <w:r>
@@ -15058,8 +15337,30 @@
         <w:rPr>
           <w:lang w:val="en-US"/>
         </w:rPr>
-        <w:t xml:space="preserve"> release 2.postman_collection.json</w:t>
-      </w:r>
+        <w:t xml:space="preserve"> release </w:t>
+      </w:r>
+      <w:proofErr w:type="gramStart"/>
+      <w:r>
+        <w:rPr>
+          <w:lang w:val="en-US"/>
+        </w:rPr>
+        <w:t>2.postman</w:t>
+      </w:r>
+      <w:proofErr w:type="gramEnd"/>
+      <w:r>
+        <w:rPr>
+          <w:lang w:val="en-US"/>
+        </w:rPr>
+        <w:t>_</w:t>
+      </w:r>
+      <w:proofErr w:type="gramStart"/>
+      <w:r>
+        <w:rPr>
+          <w:lang w:val="en-US"/>
+        </w:rPr>
+        <w:t>collection.json</w:t>
+      </w:r>
+      <w:proofErr w:type="gramEnd"/>
       <w:r>
         <w:rPr>
           <w:lang w:val="en-US"/>

</xml_diff>